<commit_message>
Add Northern Expanse origin, Gorthon Ancient tech details, Devil governance structure
Co-authored-by: Nanozir <125153310+Nanozir@users.noreply.github.com>
</commit_message>
<xml_diff>
--- a/A (Real) Guide For Heroes.docx
+++ b/A (Real) Guide For Heroes.docx
@@ -1179,6 +1179,19 @@
         <w:pStyle w:val="Rubrik3"/>
       </w:pPr>
       <w:r>
+        <w:t>Governance</w:t>
+      </w:r>
+    </w:p>
+    <w:p>
+      <w:r>
+        <w:t>The Underworld is divided into four major regions, each governed by a Fuhmar. These are not nations in the surface sense — there is no overarching Devil state — but four distinct domains, each self-governing and responsible for its own territory. Below the Fuhmar are Constaelous, comparable in scope to a Duke, each managing a sector within the region. A Constaelous bears direct responsibility for the siphoning operations and security of their territory. A Fuhmar is required to maintain at least two wives, or one wife and one concubine. One line produces children raised for governance, architecture, and succession. The other produces children raised for protection, siphoning, and war. This division is structural, not sentimental — it ensures continuity of both administration and defense.</w:t>
+      </w:r>
+    </w:p>
+    <w:p>
+      <w:pPr>
+        <w:pStyle w:val="Rubrik3"/>
+      </w:pPr>
+      <w:r>
         <w:t>Mana Management</w:t>
       </w:r>
     </w:p>
@@ -1448,10 +1461,10 @@
     </w:p>
     <w:p>
       <w:r>
-        <w:t xml:space="preserve">The frigid continent in the far northeast. A land of eternal winter, towering glaciers, and frozen taiga. The ancestral and primary home of the Elves, who have thrived here by blending magic with advanced geothermal and steam technology. </w:t>
-      </w:r>
-      <w:r>
-        <w:t>Isolated and culturally distinct from the southern kingdoms.</w:t>
+        <w:t xml:space="preserve">The frigid continent in the far northeast. A land of eternal winter, towering glaciers, and frozen taiga. The Northern Expanse was not always this way. During a past Doomsday, a Star-6 monster emerged and left a permanent mark on the continent, turning it into a frozen wasteland that nearly triggered a full ice age. The crisis was contained but never reversed, leaving conditions comparable to northern Iceland at best. The ancestral and primary home of the Elves, who survived by unearthing Ancient complexes buried beneath the frost and reverse-engineering their technology. Using these recovered designs as a foundation, they built new systems to conquer the cold — geothermal engines, insulated city-structures, and steam-powered infrastructure that keeps civilization alive against a continent that would otherwise kill it. </w:t>
+      </w:r>
+      <w:r>
+        <w:t>Due to their distance from Kremantin, the Federation does not rely on Heroes or outside aid. They have faced every crisis alone and intend to keep it that way.</w:t>
       </w:r>
     </w:p>
     <w:p>
@@ -3043,7 +3056,7 @@
     </w:p>
     <w:p>
       <w:r>
-        <w:t>Compared to most human nations, the Federation has technologically outpaced them, reaching levels closer to advanced magi-tech industry rather than relying purely on inherited hero knowledge. While humans have benefited more directly from previous heroes overall, the Federation’s progress is notable precisely because much of it was achieved through its own refinement, adaptation, and long-term continuity.</w:t>
+        <w:t>Compared to most human nations, the Federation has technologically outpaced them, reaching levels closer to advanced magi-tech industry rather than relying purely on inherited hero knowledge. While humans have benefited more directly from previous heroes overall, the Federation’s progress is notable precisely because much of it was achieved through its own excavation of Ancient complexes, reverse-engineering of pre-Cataclysm designs, and long-term continuity rather than outside intervention.</w:t>
       </w:r>
     </w:p>
     <w:p>

</xml_diff>